<commit_message>
Insert Zenodo DOI 10.5281/zenodo.22681002 into release documents and README
</commit_message>
<xml_diff>
--- a/release_v4_1/The_Accuracy_Illusion_v4_1_REVISED.docx
+++ b/release_v4_1/The_Accuracy_Illusion_v4_1_REVISED.docx
@@ -85,7 +85,7 @@
         <w:t xml:space="preserve"> </w:t>
       </w:r>
       <w:r>
-        <w:t xml:space="preserve">Simulation code, the executed BCI code and prediction records, and revision-specific reporting scripts are supplied in the accompanying reproducibility releases. The exact Version 4.1 package is archived at [INSERT OSF/ZENODO DOI OF THE PUBLISHED V4.1 RELEASE]. The project repository is https://github.com/harrisondfletcher/accuracy-illusion. The Open Practices Statement identifies the distinction between the project repository and the versioned archived release.</w:t>
+        <w:t xml:space="preserve">Simulation code, the executed BCI code and prediction records, and revision-specific reporting scripts are supplied in the accompanying reproducibility releases. The exact Version 4.1 package is archived at https://doi.org/10.5281/zenodo.22681002. The project repository is https://github.com/harrisondfletcher/accuracy-illusion. The Open Practices Statement identifies the distinction between the project repository and the versioned archived release.</w:t>
       </w:r>
     </w:p>
     <w:bookmarkStart w:id="18" w:name="abstract"/>
@@ -17603,7 +17603,7 @@
         <w:widowControl/>
       </w:pPr>
       <w:r>
-        <w:t xml:space="preserve">The materials supporting this revision are supplied in the accompanying simulation and BCI reproducibility releases, together with the Version 4.1 reporting supplement. They include synthetic worked-example data, simulation outputs and code, executed BCI configuration and environment records, prediction CSVs, the trial ledger, and reporting scripts. The exact Version 4.1 package supporting this revision is archived at [INSERT OSF/ZENODO DOI OF THE PUBLISHED V4.1 RELEASE]; that versioned archive, rather than the unversioned project page (https://github.com/harrisondfletcher/accuracy-illusion), identifies the numerical sources of this revision. Raw BCI data are available from the official BNCI 001-2014 source (https://bnci-horizon-2020.eu/database/data-sets/001-2014/).</w:t>
+        <w:t xml:space="preserve">The materials supporting this revision are supplied in the accompanying simulation and BCI reproducibility releases, together with the Version 4.1 reporting supplement. They include synthetic worked-example data, simulation outputs and code, executed BCI configuration and environment records, prediction CSVs, the trial ledger, and reporting scripts. The exact Version 4.1 package supporting this revision is archived at https://doi.org/10.5281/zenodo.22681002; that versioned archive, rather than the unversioned project page (https://github.com/harrisondfletcher/accuracy-illusion), identifies the numerical sources of this revision. Raw BCI data are available from the official BNCI 001-2014 source (https://bnci-horizon-2020.eu/database/data-sets/001-2014/).</w:t>
       </w:r>
     </w:p>
     <w:p>

</xml_diff>